<commit_message>
PPT M2, QP's, Notes Added
</commit_message>
<xml_diff>
--- a/Lab/Program 1.docx
+++ b/Lab/Program 1.docx
@@ -220,11 +220,6 @@
       <w:pPr>
         <w:spacing w:after="0" w:line="276" w:lineRule="auto"/>
       </w:pPr>
-    </w:p>
-    <w:p>
-      <w:pPr>
-        <w:spacing w:after="0" w:line="276" w:lineRule="auto"/>
-      </w:pPr>
       <w:r>
         <w:t xml:space="preserve">    if (</w:t>
       </w:r>
@@ -468,15 +463,7 @@
       </w:r>
       <w:proofErr w:type="spellEnd"/>
       <w:r>
-        <w:t xml:space="preserve">(), </w:t>
-      </w:r>
-      <w:proofErr w:type="spellStart"/>
-      <w:r>
-        <w:t>pid</w:t>
-      </w:r>
-      <w:proofErr w:type="spellEnd"/>
-      <w:r>
-        <w:t>);</w:t>
+        <w:t>(), pid);</w:t>
       </w:r>
     </w:p>
     <w:p>
@@ -624,28 +611,28 @@
         <w:spacing w:after="0" w:line="276" w:lineRule="auto"/>
       </w:pPr>
       <w:r>
+        <w:t xml:space="preserve">            </w:t>
+      </w:r>
+      <w:proofErr w:type="spellStart"/>
+      <w:proofErr w:type="gramStart"/>
+      <w:r>
+        <w:t>printf</w:t>
+      </w:r>
+      <w:proofErr w:type="spellEnd"/>
+      <w:r>
+        <w:t>(</w:t>
+      </w:r>
+      <w:proofErr w:type="gramEnd"/>
+      <w:r>
+        <w:t>"Child process did not exit normally\n");</w:t>
+      </w:r>
+    </w:p>
+    <w:p>
+      <w:pPr>
+        <w:spacing w:after="0" w:line="276" w:lineRule="auto"/>
+      </w:pPr>
+      <w:r>
         <w:lastRenderedPageBreak/>
-        <w:t xml:space="preserve">            </w:t>
-      </w:r>
-      <w:proofErr w:type="spellStart"/>
-      <w:proofErr w:type="gramStart"/>
-      <w:r>
-        <w:t>printf</w:t>
-      </w:r>
-      <w:proofErr w:type="spellEnd"/>
-      <w:r>
-        <w:t>(</w:t>
-      </w:r>
-      <w:proofErr w:type="gramEnd"/>
-      <w:r>
-        <w:t>"Child process did not exit normally\n");</w:t>
-      </w:r>
-    </w:p>
-    <w:p>
-      <w:pPr>
-        <w:spacing w:after="0" w:line="276" w:lineRule="auto"/>
-      </w:pPr>
-      <w:r>
         <w:t xml:space="preserve">        }</w:t>
       </w:r>
     </w:p>
@@ -1454,6 +1441,7 @@
   <w:style w:type="character" w:default="1" w:styleId="DefaultParagraphFont">
     <w:name w:val="Default Paragraph Font"/>
     <w:uiPriority w:val="1"/>
+    <w:semiHidden/>
     <w:unhideWhenUsed/>
   </w:style>
   <w:style w:type="table" w:default="1" w:styleId="TableNormal">

</xml_diff>